<commit_message>
Anonymize cover letter per EM item type 'Anonymous Cover Letter - must not contain any author details'; document full item-type mapping for submission
</commit_message>
<xml_diff>
--- a/final/submission_0907/Cover letter 0907.docx
+++ b/final/submission_0907/Cover letter 0907.docx
@@ -111,7 +111,7 @@
         <w:pStyle w:val="BodyText"/>
       </w:pPr>
       <w:r>
-        <w:t xml:space="preserve">Xueyuan Che (School of Instrument Science and Engineering, Southeast University)</w:t>
+        <w:t xml:space="preserve">The Authors</w:t>
       </w:r>
     </w:p>
     <w:p>
@@ -119,7 +119,7 @@
         <w:pStyle w:val="BodyText"/>
       </w:pPr>
       <w:r>
-        <w:t xml:space="preserve">Libo Sun (Corresponding author, School of Instrument Science and Engineering, Southeast University, Nanjing 210096, China; sunlibo@seu.edu.cn)</w:t>
+        <w:t xml:space="preserve">(Per the journal’s double-anonymized review policy, this cover letter contains no author details; author names, affiliations, and the corresponding author’s contact information are provided on the separately uploaded title page and in Editorial Manager.)</w:t>
       </w:r>
     </w:p>
     <w:bookmarkEnd w:id="20"/>

</xml_diff>

<commit_message>
Comply with CG 'Extended Versions of Conference Papers': rename journal title (old title identical to conference Paper 75), add conference self-citation [41] + extension statements in intro/abstract/conclusions, attach original conference paper as supplementary; letters rebuilt with recorded pandoc geometry margin 2.5cm; all PDFs/docx/latex.zip synced and verified (15/16/22pp, 0 errors, 0 author leaks, abstract 249 words)
</commit_message>
<xml_diff>
--- a/final/submission_0907/Cover letter 0907.docx
+++ b/final/submission_0907/Cover letter 0907.docx
@@ -33,7 +33,7 @@
         <w:t xml:space="preserve">“</w:t>
       </w:r>
       <w:r>
-        <w:t xml:space="preserve">Adapter Scaling Trade-off and Timestep-Conditioned Scheduling in Multi-view Diffusion Texture Generation</w:t>
+        <w:t xml:space="preserve">Timestep-Conditioned Adapter Scaling for Multi-view Diffusion Texture Generation</w:t>
       </w:r>
       <w:r>
         <w:t xml:space="preserve">”</w:t>
@@ -71,7 +71,7 @@
         <w:t xml:space="preserve"> </w:t>
       </w:r>
       <w:r>
-        <w:t xml:space="preserve">(upon revision, Paper 75).</w:t>
+        <w:t xml:space="preserve">(upon revision, Paper 75). In accordance with the journal’s guidelines for extended versions of conference papers, a copy of the original conference paper (Paper 75) is attached as supplementary material, and the manuscript explicitly states the extensions relative to it.</w:t>
       </w:r>
     </w:p>
     <w:p>

</xml_diff>

<commit_message>
Cover letter audit fixes per Guide for Authors: remove author-declarations sentence (guide forbids declarations in cover letters), correct CFG prior-art status to NeurIPS 2024 and section refs to 2.3/4.4 (verified against tex); docx regenerated and synced
</commit_message>
<xml_diff>
--- a/final/submission_0907/Cover letter 0907.docx
+++ b/final/submission_0907/Cover letter 0907.docx
@@ -79,15 +79,7 @@
         <w:pStyle w:val="BodyText"/>
       </w:pPr>
       <w:r>
-        <w:t xml:space="preserve">In this manuscript, we study a fine-grained inference-time control problem in geometry-controlled multi-view diffusion texturing: how strongly, and at which denoising stages, a geometric adapter should act. We first show that a uniform adapter scale is a blunt control — aggressive uniform scales improve structural metrics such as FG-SSIM but suppress the texture synthesis capability of the base model, causing surface flattening and loss of high-frequency detail. We then formalize the effect with a measurable Correction–Alignment–Interference (CAI) stage-utility model and derive Timestep-Conditioned Adapter Scaling (TCAS), a training-free low–high–low schedule that concentrates geometric correction in the middle denoising stage. The schedule C3 = (1.25, 2.50, 1.25) is selected using only a 24-object probe set and then evaluated unchanged, without further search, on the strictly disjoint 276-object holdout (pooled 300-object statistics also reported), where it matches the structure of aggressive scaling while improving PSNR by 0.96 dB, retaining substantially more texture, and receiving the highest overall preference (58.1%) in a blinded human study with cluster-aware significance analysis. To the best of our knowledge, no prior work analyzes the shape–texture trade-off of adapter scaling or derives a timestep-conditioned schedule from measurable stage utilities; the closest prior art (MVPainter, arXiv 2025; MV-Adapter, arXiv 2024; ControlNet, ICCV 2023; classifier-free guidance scheduling, NeurIPS Workshop 2022) is cited and compared explicitly in Sections 2 and 4.7 of the manuscript.</w:t>
-      </w:r>
-    </w:p>
-    <w:p>
-      <w:pPr>
-        <w:pStyle w:val="BodyText"/>
-      </w:pPr>
-      <w:r>
-        <w:t xml:space="preserve">This manuscript is original, has not been published previously, and is not under consideration elsewhere. All authors have approved the submission and declare no competing interests.</w:t>
+        <w:t xml:space="preserve">In this manuscript, we study a fine-grained inference-time control problem in geometry-controlled multi-view diffusion texturing: how strongly, and at which denoising stages, a geometric adapter should act. We first show that a uniform adapter scale is a blunt control — aggressive uniform scales improve structural metrics such as FG-SSIM but suppress the texture synthesis capability of the base model, causing surface flattening and loss of high-frequency detail. We then formalize the effect with a measurable Correction–Alignment–Interference (CAI) stage-utility model and derive Timestep-Conditioned Adapter Scaling (TCAS), a training-free low–high–low schedule that concentrates geometric correction in the middle denoising stage. The schedule C3 = (1.25, 2.50, 1.25) is selected using only a 24-object probe set and then evaluated unchanged, without further search, on the strictly disjoint 276-object holdout (pooled 300-object statistics also reported), where it matches the structure of aggressive scaling while improving PSNR by 0.96 dB, retaining substantially more texture, and receiving the highest overall preference (58.1%) in a blinded human study with cluster-aware significance analysis. To the best of our knowledge, no prior work analyzes the shape–texture trade-off of adapter scaling or derives a timestep-conditioned schedule from measurable stage utilities; the closest prior art (MVPainter, arXiv 2025; MV-Adapter, arXiv 2024; ControlNet, ICCV 2023; limited-interval classifier-free guidance, NeurIPS 2024) is cited and compared explicitly in Sections 2.3 and 4.4 of the manuscript.</w:t>
       </w:r>
     </w:p>
     <w:p>

</xml_diff>